<commit_message>
feat(analysis): add 2021 premature ASMR correlations for 2019 voting
Pin the ONS 2021 workbook separately and add female and male Spearman/Pearson coefficients, p values and sample sizes to Section 4. Use direct 2019 constituency-code joins only, without a 2024 boundary proxy. Refresh notebook outputs and the one-page full Word table while preserving all 120 existing coefficients and 120 p values.
</commit_message>
<xml_diff>
--- a/output/tables/full_correlation_and_p_value_table.docx
+++ b/output/tables/full_correlation_and_p_value_table.docx
@@ -28,6 +28,19 @@
           <w:szCs w:val="10"/>
         </w:rPr>
         <w:t xml:space="preserve">Cells show correlation coefficient (p value). ASMR denotes age-standardised mortality rate per 100,000 population.</w:t>
+      </w:r>
+    </w:p>
+    <w:p>
+      <w:pPr>
+        <w:spacing w:after="20" w:line="140" w:lineRule="exact"/>
+      </w:pPr>
+      <w:r>
+        <w:rPr>
+          <w:rFonts w:ascii="Arial Narrow" w:hAnsi="Arial Narrow" w:cs="Arial Narrow"/>
+          <w:sz w:val="10"/>
+          <w:szCs w:val="10"/>
+        </w:rPr>
+        <w:t xml:space="preserve">Year is election year. Premature ASMR (2021) uses deaths registered in 2021 and pre-2024 boundaries; it is included for the 2019 election only, without a 2024 boundary proxy.</w:t>
       </w:r>
     </w:p>
     <w:p>
@@ -147,7 +160,7 @@
                 <w:sz w:val="14"/>
                 <w:szCs w:val="14"/>
               </w:rPr>
-              <w:t xml:space="preserve">Year</w:t>
+              <w:t xml:space="preserve">Election year</w:t>
             </w:r>
           </w:p>
         </w:tc>
@@ -1658,7 +1671,7 @@
                 <w:sz w:val="14"/>
                 <w:szCs w:val="14"/>
               </w:rPr>
-              <w:t xml:space="preserve">Pearson</w:t>
+              <w:t xml:space="preserve">Spearman</w:t>
             </w:r>
           </w:p>
         </w:tc>
@@ -1682,7 +1695,7 @@
                 <w:sz w:val="14"/>
                 <w:szCs w:val="14"/>
               </w:rPr>
-              <w:t xml:space="preserve">ASMR, female</w:t>
+              <w:t xml:space="preserve">Premature ASMR (2021), female</w:t>
             </w:r>
           </w:p>
         </w:tc>
@@ -1754,103 +1767,103 @@
                 <w:sz w:val="14"/>
                 <w:szCs w:val="14"/>
               </w:rPr>
-              <w:t xml:space="preserve">-0.341 (&lt;0.001)</w:t>
-            </w:r>
-          </w:p>
-        </w:tc>
-        <w:tc>
-          <w:tcPr>
-            <w:tcW w:w="2200" w:type="dxa"/>
-            <w:tcMar>
-              <w:top w:w="20" w:type="dxa"/>
-              <w:left w:w="20" w:type="dxa"/>
-              <w:bottom w:w="20" w:type="dxa"/>
-              <w:right w:w="20" w:type="dxa"/>
-            </w:tcMar>
-          </w:tcPr>
-          <w:p>
-            <w:pPr>
-              <w:spacing w:after="0" w:line="120" w:lineRule="exact"/>
-            </w:pPr>
-            <w:r>
-              <w:rPr>
-                <w:rFonts w:ascii="Arial Narrow" w:hAnsi="Arial Narrow" w:cs="Arial Narrow"/>
-                <w:sz w:val="14"/>
-                <w:szCs w:val="14"/>
-              </w:rPr>
-              <w:t xml:space="preserve">0.512 (&lt;0.001)</w:t>
-            </w:r>
-          </w:p>
-        </w:tc>
-        <w:tc>
-          <w:tcPr>
-            <w:tcW w:w="2200" w:type="dxa"/>
-            <w:tcMar>
-              <w:top w:w="20" w:type="dxa"/>
-              <w:left w:w="20" w:type="dxa"/>
-              <w:bottom w:w="20" w:type="dxa"/>
-              <w:right w:w="20" w:type="dxa"/>
-            </w:tcMar>
-          </w:tcPr>
-          <w:p>
-            <w:pPr>
-              <w:spacing w:after="0" w:line="120" w:lineRule="exact"/>
-            </w:pPr>
-            <w:r>
-              <w:rPr>
-                <w:rFonts w:ascii="Arial Narrow" w:hAnsi="Arial Narrow" w:cs="Arial Narrow"/>
-                <w:sz w:val="14"/>
-                <w:szCs w:val="14"/>
-              </w:rPr>
-              <w:t xml:space="preserve">-0.554 (&lt;0.001)</w:t>
-            </w:r>
-          </w:p>
-        </w:tc>
-        <w:tc>
-          <w:tcPr>
-            <w:tcW w:w="2200" w:type="dxa"/>
-            <w:tcMar>
-              <w:top w:w="20" w:type="dxa"/>
-              <w:left w:w="20" w:type="dxa"/>
-              <w:bottom w:w="20" w:type="dxa"/>
-              <w:right w:w="20" w:type="dxa"/>
-            </w:tcMar>
-          </w:tcPr>
-          <w:p>
-            <w:pPr>
-              <w:spacing w:after="0" w:line="120" w:lineRule="exact"/>
-            </w:pPr>
-            <w:r>
-              <w:rPr>
-                <w:rFonts w:ascii="Arial Narrow" w:hAnsi="Arial Narrow" w:cs="Arial Narrow"/>
-                <w:sz w:val="14"/>
-                <w:szCs w:val="14"/>
-              </w:rPr>
-              <w:t xml:space="preserve">0.558 (&lt;0.001)</w:t>
-            </w:r>
-          </w:p>
-        </w:tc>
-        <w:tc>
-          <w:tcPr>
-            <w:tcW w:w="2200" w:type="dxa"/>
-            <w:tcMar>
-              <w:top w:w="20" w:type="dxa"/>
-              <w:left w:w="20" w:type="dxa"/>
-              <w:bottom w:w="20" w:type="dxa"/>
-              <w:right w:w="20" w:type="dxa"/>
-            </w:tcMar>
-          </w:tcPr>
-          <w:p>
-            <w:pPr>
-              <w:spacing w:after="0" w:line="120" w:lineRule="exact"/>
-            </w:pPr>
-            <w:r>
-              <w:rPr>
-                <w:rFonts w:ascii="Arial Narrow" w:hAnsi="Arial Narrow" w:cs="Arial Narrow"/>
-                <w:sz w:val="14"/>
-                <w:szCs w:val="14"/>
-              </w:rPr>
-              <w:t xml:space="preserve">-0.714 (&lt;0.001)</w:t>
+              <w:t xml:space="preserve">-0.447 (&lt;0.001)</w:t>
+            </w:r>
+          </w:p>
+        </w:tc>
+        <w:tc>
+          <w:tcPr>
+            <w:tcW w:w="2200" w:type="dxa"/>
+            <w:tcMar>
+              <w:top w:w="20" w:type="dxa"/>
+              <w:left w:w="20" w:type="dxa"/>
+              <w:bottom w:w="20" w:type="dxa"/>
+              <w:right w:w="20" w:type="dxa"/>
+            </w:tcMar>
+          </w:tcPr>
+          <w:p>
+            <w:pPr>
+              <w:spacing w:after="0" w:line="120" w:lineRule="exact"/>
+            </w:pPr>
+            <w:r>
+              <w:rPr>
+                <w:rFonts w:ascii="Arial Narrow" w:hAnsi="Arial Narrow" w:cs="Arial Narrow"/>
+                <w:sz w:val="14"/>
+                <w:szCs w:val="14"/>
+              </w:rPr>
+              <w:t xml:space="preserve">0.666 (&lt;0.001)</w:t>
+            </w:r>
+          </w:p>
+        </w:tc>
+        <w:tc>
+          <w:tcPr>
+            <w:tcW w:w="2200" w:type="dxa"/>
+            <w:tcMar>
+              <w:top w:w="20" w:type="dxa"/>
+              <w:left w:w="20" w:type="dxa"/>
+              <w:bottom w:w="20" w:type="dxa"/>
+              <w:right w:w="20" w:type="dxa"/>
+            </w:tcMar>
+          </w:tcPr>
+          <w:p>
+            <w:pPr>
+              <w:spacing w:after="0" w:line="120" w:lineRule="exact"/>
+            </w:pPr>
+            <w:r>
+              <w:rPr>
+                <w:rFonts w:ascii="Arial Narrow" w:hAnsi="Arial Narrow" w:cs="Arial Narrow"/>
+                <w:sz w:val="14"/>
+                <w:szCs w:val="14"/>
+              </w:rPr>
+              <w:t xml:space="preserve">-0.706 (&lt;0.001)</w:t>
+            </w:r>
+          </w:p>
+        </w:tc>
+        <w:tc>
+          <w:tcPr>
+            <w:tcW w:w="2200" w:type="dxa"/>
+            <w:tcMar>
+              <w:top w:w="20" w:type="dxa"/>
+              <w:left w:w="20" w:type="dxa"/>
+              <w:bottom w:w="20" w:type="dxa"/>
+              <w:right w:w="20" w:type="dxa"/>
+            </w:tcMar>
+          </w:tcPr>
+          <w:p>
+            <w:pPr>
+              <w:spacing w:after="0" w:line="120" w:lineRule="exact"/>
+            </w:pPr>
+            <w:r>
+              <w:rPr>
+                <w:rFonts w:ascii="Arial Narrow" w:hAnsi="Arial Narrow" w:cs="Arial Narrow"/>
+                <w:sz w:val="14"/>
+                <w:szCs w:val="14"/>
+              </w:rPr>
+              <w:t xml:space="preserve">0.639 (&lt;0.001)</w:t>
+            </w:r>
+          </w:p>
+        </w:tc>
+        <w:tc>
+          <w:tcPr>
+            <w:tcW w:w="2200" w:type="dxa"/>
+            <w:tcMar>
+              <w:top w:w="20" w:type="dxa"/>
+              <w:left w:w="20" w:type="dxa"/>
+              <w:bottom w:w="20" w:type="dxa"/>
+              <w:right w:w="20" w:type="dxa"/>
+            </w:tcMar>
+          </w:tcPr>
+          <w:p>
+            <w:pPr>
+              <w:spacing w:after="0" w:line="120" w:lineRule="exact"/>
+            </w:pPr>
+            <w:r>
+              <w:rPr>
+                <w:rFonts w:ascii="Arial Narrow" w:hAnsi="Arial Narrow" w:cs="Arial Narrow"/>
+                <w:sz w:val="14"/>
+                <w:szCs w:val="14"/>
+              </w:rPr>
+              <w:t xml:space="preserve">-0.792 (&lt;0.001)</w:t>
             </w:r>
           </w:p>
         </w:tc>
@@ -1879,7 +1892,7 @@
                 <w:sz w:val="14"/>
                 <w:szCs w:val="14"/>
               </w:rPr>
-              <w:t xml:space="preserve">Pearson</w:t>
+              <w:t xml:space="preserve">Spearman</w:t>
             </w:r>
           </w:p>
         </w:tc>
@@ -1903,7 +1916,7 @@
                 <w:sz w:val="14"/>
                 <w:szCs w:val="14"/>
               </w:rPr>
-              <w:t xml:space="preserve">ASMR, male</w:t>
+              <w:t xml:space="preserve">Premature ASMR (2021), male</w:t>
             </w:r>
           </w:p>
         </w:tc>
@@ -1975,103 +1988,103 @@
                 <w:sz w:val="14"/>
                 <w:szCs w:val="14"/>
               </w:rPr>
-              <w:t xml:space="preserve">-0.434 (&lt;0.001)</w:t>
-            </w:r>
-          </w:p>
-        </w:tc>
-        <w:tc>
-          <w:tcPr>
-            <w:tcW w:w="2200" w:type="dxa"/>
-            <w:tcMar>
-              <w:top w:w="20" w:type="dxa"/>
-              <w:left w:w="20" w:type="dxa"/>
-              <w:bottom w:w="20" w:type="dxa"/>
-              <w:right w:w="20" w:type="dxa"/>
-            </w:tcMar>
-          </w:tcPr>
-          <w:p>
-            <w:pPr>
-              <w:spacing w:after="0" w:line="120" w:lineRule="exact"/>
-            </w:pPr>
-            <w:r>
-              <w:rPr>
-                <w:rFonts w:ascii="Arial Narrow" w:hAnsi="Arial Narrow" w:cs="Arial Narrow"/>
-                <w:sz w:val="14"/>
-                <w:szCs w:val="14"/>
-              </w:rPr>
-              <w:t xml:space="preserve">0.576 (&lt;0.001)</w:t>
-            </w:r>
-          </w:p>
-        </w:tc>
-        <w:tc>
-          <w:tcPr>
-            <w:tcW w:w="2200" w:type="dxa"/>
-            <w:tcMar>
-              <w:top w:w="20" w:type="dxa"/>
-              <w:left w:w="20" w:type="dxa"/>
-              <w:bottom w:w="20" w:type="dxa"/>
-              <w:right w:w="20" w:type="dxa"/>
-            </w:tcMar>
-          </w:tcPr>
-          <w:p>
-            <w:pPr>
-              <w:spacing w:after="0" w:line="120" w:lineRule="exact"/>
-            </w:pPr>
-            <w:r>
-              <w:rPr>
-                <w:rFonts w:ascii="Arial Narrow" w:hAnsi="Arial Narrow" w:cs="Arial Narrow"/>
-                <w:sz w:val="14"/>
-                <w:szCs w:val="14"/>
-              </w:rPr>
-              <w:t xml:space="preserve">-0.523 (&lt;0.001)</w:t>
-            </w:r>
-          </w:p>
-        </w:tc>
-        <w:tc>
-          <w:tcPr>
-            <w:tcW w:w="2200" w:type="dxa"/>
-            <w:tcMar>
-              <w:top w:w="20" w:type="dxa"/>
-              <w:left w:w="20" w:type="dxa"/>
-              <w:bottom w:w="20" w:type="dxa"/>
-              <w:right w:w="20" w:type="dxa"/>
-            </w:tcMar>
-          </w:tcPr>
-          <w:p>
-            <w:pPr>
-              <w:spacing w:after="0" w:line="120" w:lineRule="exact"/>
-            </w:pPr>
-            <w:r>
-              <w:rPr>
-                <w:rFonts w:ascii="Arial Narrow" w:hAnsi="Arial Narrow" w:cs="Arial Narrow"/>
-                <w:sz w:val="14"/>
-                <w:szCs w:val="14"/>
-              </w:rPr>
-              <w:t xml:space="preserve">0.549 (&lt;0.001)</w:t>
-            </w:r>
-          </w:p>
-        </w:tc>
-        <w:tc>
-          <w:tcPr>
-            <w:tcW w:w="2200" w:type="dxa"/>
-            <w:tcMar>
-              <w:top w:w="20" w:type="dxa"/>
-              <w:left w:w="20" w:type="dxa"/>
-              <w:bottom w:w="20" w:type="dxa"/>
-              <w:right w:w="20" w:type="dxa"/>
-            </w:tcMar>
-          </w:tcPr>
-          <w:p>
-            <w:pPr>
-              <w:spacing w:after="0" w:line="120" w:lineRule="exact"/>
-            </w:pPr>
-            <w:r>
-              <w:rPr>
-                <w:rFonts w:ascii="Arial Narrow" w:hAnsi="Arial Narrow" w:cs="Arial Narrow"/>
-                <w:sz w:val="14"/>
-                <w:szCs w:val="14"/>
-              </w:rPr>
-              <w:t xml:space="preserve">-0.746 (&lt;0.001)</w:t>
+              <w:t xml:space="preserve">-0.514 (&lt;0.001)</w:t>
+            </w:r>
+          </w:p>
+        </w:tc>
+        <w:tc>
+          <w:tcPr>
+            <w:tcW w:w="2200" w:type="dxa"/>
+            <w:tcMar>
+              <w:top w:w="20" w:type="dxa"/>
+              <w:left w:w="20" w:type="dxa"/>
+              <w:bottom w:w="20" w:type="dxa"/>
+              <w:right w:w="20" w:type="dxa"/>
+            </w:tcMar>
+          </w:tcPr>
+          <w:p>
+            <w:pPr>
+              <w:spacing w:after="0" w:line="120" w:lineRule="exact"/>
+            </w:pPr>
+            <w:r>
+              <w:rPr>
+                <w:rFonts w:ascii="Arial Narrow" w:hAnsi="Arial Narrow" w:cs="Arial Narrow"/>
+                <w:sz w:val="14"/>
+                <w:szCs w:val="14"/>
+              </w:rPr>
+              <w:t xml:space="preserve">0.724 (&lt;0.001)</w:t>
+            </w:r>
+          </w:p>
+        </w:tc>
+        <w:tc>
+          <w:tcPr>
+            <w:tcW w:w="2200" w:type="dxa"/>
+            <w:tcMar>
+              <w:top w:w="20" w:type="dxa"/>
+              <w:left w:w="20" w:type="dxa"/>
+              <w:bottom w:w="20" w:type="dxa"/>
+              <w:right w:w="20" w:type="dxa"/>
+            </w:tcMar>
+          </w:tcPr>
+          <w:p>
+            <w:pPr>
+              <w:spacing w:after="0" w:line="120" w:lineRule="exact"/>
+            </w:pPr>
+            <w:r>
+              <w:rPr>
+                <w:rFonts w:ascii="Arial Narrow" w:hAnsi="Arial Narrow" w:cs="Arial Narrow"/>
+                <w:sz w:val="14"/>
+                <w:szCs w:val="14"/>
+              </w:rPr>
+              <w:t xml:space="preserve">-0.685 (&lt;0.001)</w:t>
+            </w:r>
+          </w:p>
+        </w:tc>
+        <w:tc>
+          <w:tcPr>
+            <w:tcW w:w="2200" w:type="dxa"/>
+            <w:tcMar>
+              <w:top w:w="20" w:type="dxa"/>
+              <w:left w:w="20" w:type="dxa"/>
+              <w:bottom w:w="20" w:type="dxa"/>
+              <w:right w:w="20" w:type="dxa"/>
+            </w:tcMar>
+          </w:tcPr>
+          <w:p>
+            <w:pPr>
+              <w:spacing w:after="0" w:line="120" w:lineRule="exact"/>
+            </w:pPr>
+            <w:r>
+              <w:rPr>
+                <w:rFonts w:ascii="Arial Narrow" w:hAnsi="Arial Narrow" w:cs="Arial Narrow"/>
+                <w:sz w:val="14"/>
+                <w:szCs w:val="14"/>
+              </w:rPr>
+              <w:t xml:space="preserve">0.644 (&lt;0.001)</w:t>
+            </w:r>
+          </w:p>
+        </w:tc>
+        <w:tc>
+          <w:tcPr>
+            <w:tcW w:w="2200" w:type="dxa"/>
+            <w:tcMar>
+              <w:top w:w="20" w:type="dxa"/>
+              <w:left w:w="20" w:type="dxa"/>
+              <w:bottom w:w="20" w:type="dxa"/>
+              <w:right w:w="20" w:type="dxa"/>
+            </w:tcMar>
+          </w:tcPr>
+          <w:p>
+            <w:pPr>
+              <w:spacing w:after="0" w:line="120" w:lineRule="exact"/>
+            </w:pPr>
+            <w:r>
+              <w:rPr>
+                <w:rFonts w:ascii="Arial Narrow" w:hAnsi="Arial Narrow" w:cs="Arial Narrow"/>
+                <w:sz w:val="14"/>
+                <w:szCs w:val="14"/>
+              </w:rPr>
+              <w:t xml:space="preserve">-0.804 (&lt;0.001)</w:t>
             </w:r>
           </w:p>
         </w:tc>
@@ -2124,7 +2137,7 @@
                 <w:sz w:val="14"/>
                 <w:szCs w:val="14"/>
               </w:rPr>
-              <w:t xml:space="preserve">Not good health</w:t>
+              <w:t xml:space="preserve">ASMR, female</w:t>
             </w:r>
           </w:p>
         </w:tc>
@@ -2196,103 +2209,103 @@
                 <w:sz w:val="14"/>
                 <w:szCs w:val="14"/>
               </w:rPr>
-              <w:t xml:space="preserve">0.035 (0.416)</w:t>
-            </w:r>
-          </w:p>
-        </w:tc>
-        <w:tc>
-          <w:tcPr>
-            <w:tcW w:w="2200" w:type="dxa"/>
-            <w:tcMar>
-              <w:top w:w="20" w:type="dxa"/>
-              <w:left w:w="20" w:type="dxa"/>
-              <w:bottom w:w="20" w:type="dxa"/>
-              <w:right w:w="20" w:type="dxa"/>
-            </w:tcMar>
-          </w:tcPr>
-          <w:p>
-            <w:pPr>
-              <w:spacing w:after="0" w:line="120" w:lineRule="exact"/>
-            </w:pPr>
-            <w:r>
-              <w:rPr>
-                <w:rFonts w:ascii="Arial Narrow" w:hAnsi="Arial Narrow" w:cs="Arial Narrow"/>
-                <w:sz w:val="14"/>
-                <w:szCs w:val="14"/>
-              </w:rPr>
-              <w:t xml:space="preserve">0.145 (&lt;0.001)</w:t>
-            </w:r>
-          </w:p>
-        </w:tc>
-        <w:tc>
-          <w:tcPr>
-            <w:tcW w:w="2200" w:type="dxa"/>
-            <w:tcMar>
-              <w:top w:w="20" w:type="dxa"/>
-              <w:left w:w="20" w:type="dxa"/>
-              <w:bottom w:w="20" w:type="dxa"/>
-              <w:right w:w="20" w:type="dxa"/>
-            </w:tcMar>
-          </w:tcPr>
-          <w:p>
-            <w:pPr>
-              <w:spacing w:after="0" w:line="120" w:lineRule="exact"/>
-            </w:pPr>
-            <w:r>
-              <w:rPr>
-                <w:rFonts w:ascii="Arial Narrow" w:hAnsi="Arial Narrow" w:cs="Arial Narrow"/>
-                <w:sz w:val="14"/>
-                <w:szCs w:val="14"/>
-              </w:rPr>
-              <w:t xml:space="preserve">-0.477 (&lt;0.001)</w:t>
-            </w:r>
-          </w:p>
-        </w:tc>
-        <w:tc>
-          <w:tcPr>
-            <w:tcW w:w="2200" w:type="dxa"/>
-            <w:tcMar>
-              <w:top w:w="20" w:type="dxa"/>
-              <w:left w:w="20" w:type="dxa"/>
-              <w:bottom w:w="20" w:type="dxa"/>
-              <w:right w:w="20" w:type="dxa"/>
-            </w:tcMar>
-          </w:tcPr>
-          <w:p>
-            <w:pPr>
-              <w:spacing w:after="0" w:line="120" w:lineRule="exact"/>
-            </w:pPr>
-            <w:r>
-              <w:rPr>
-                <w:rFonts w:ascii="Arial Narrow" w:hAnsi="Arial Narrow" w:cs="Arial Narrow"/>
-                <w:sz w:val="14"/>
-                <w:szCs w:val="14"/>
-              </w:rPr>
-              <w:t xml:space="preserve">0.469 (&lt;0.001)</w:t>
-            </w:r>
-          </w:p>
-        </w:tc>
-        <w:tc>
-          <w:tcPr>
-            <w:tcW w:w="2200" w:type="dxa"/>
-            <w:tcMar>
-              <w:top w:w="20" w:type="dxa"/>
-              <w:left w:w="20" w:type="dxa"/>
-              <w:bottom w:w="20" w:type="dxa"/>
-              <w:right w:w="20" w:type="dxa"/>
-            </w:tcMar>
-          </w:tcPr>
-          <w:p>
-            <w:pPr>
-              <w:spacing w:after="0" w:line="120" w:lineRule="exact"/>
-            </w:pPr>
-            <w:r>
-              <w:rPr>
-                <w:rFonts w:ascii="Arial Narrow" w:hAnsi="Arial Narrow" w:cs="Arial Narrow"/>
-                <w:sz w:val="14"/>
-                <w:szCs w:val="14"/>
-              </w:rPr>
-              <w:t xml:space="preserve">-0.532 (&lt;0.001)</w:t>
+              <w:t xml:space="preserve">-0.341 (&lt;0.001)</w:t>
+            </w:r>
+          </w:p>
+        </w:tc>
+        <w:tc>
+          <w:tcPr>
+            <w:tcW w:w="2200" w:type="dxa"/>
+            <w:tcMar>
+              <w:top w:w="20" w:type="dxa"/>
+              <w:left w:w="20" w:type="dxa"/>
+              <w:bottom w:w="20" w:type="dxa"/>
+              <w:right w:w="20" w:type="dxa"/>
+            </w:tcMar>
+          </w:tcPr>
+          <w:p>
+            <w:pPr>
+              <w:spacing w:after="0" w:line="120" w:lineRule="exact"/>
+            </w:pPr>
+            <w:r>
+              <w:rPr>
+                <w:rFonts w:ascii="Arial Narrow" w:hAnsi="Arial Narrow" w:cs="Arial Narrow"/>
+                <w:sz w:val="14"/>
+                <w:szCs w:val="14"/>
+              </w:rPr>
+              <w:t xml:space="preserve">0.512 (&lt;0.001)</w:t>
+            </w:r>
+          </w:p>
+        </w:tc>
+        <w:tc>
+          <w:tcPr>
+            <w:tcW w:w="2200" w:type="dxa"/>
+            <w:tcMar>
+              <w:top w:w="20" w:type="dxa"/>
+              <w:left w:w="20" w:type="dxa"/>
+              <w:bottom w:w="20" w:type="dxa"/>
+              <w:right w:w="20" w:type="dxa"/>
+            </w:tcMar>
+          </w:tcPr>
+          <w:p>
+            <w:pPr>
+              <w:spacing w:after="0" w:line="120" w:lineRule="exact"/>
+            </w:pPr>
+            <w:r>
+              <w:rPr>
+                <w:rFonts w:ascii="Arial Narrow" w:hAnsi="Arial Narrow" w:cs="Arial Narrow"/>
+                <w:sz w:val="14"/>
+                <w:szCs w:val="14"/>
+              </w:rPr>
+              <w:t xml:space="preserve">-0.554 (&lt;0.001)</w:t>
+            </w:r>
+          </w:p>
+        </w:tc>
+        <w:tc>
+          <w:tcPr>
+            <w:tcW w:w="2200" w:type="dxa"/>
+            <w:tcMar>
+              <w:top w:w="20" w:type="dxa"/>
+              <w:left w:w="20" w:type="dxa"/>
+              <w:bottom w:w="20" w:type="dxa"/>
+              <w:right w:w="20" w:type="dxa"/>
+            </w:tcMar>
+          </w:tcPr>
+          <w:p>
+            <w:pPr>
+              <w:spacing w:after="0" w:line="120" w:lineRule="exact"/>
+            </w:pPr>
+            <w:r>
+              <w:rPr>
+                <w:rFonts w:ascii="Arial Narrow" w:hAnsi="Arial Narrow" w:cs="Arial Narrow"/>
+                <w:sz w:val="14"/>
+                <w:szCs w:val="14"/>
+              </w:rPr>
+              <w:t xml:space="preserve">0.558 (&lt;0.001)</w:t>
+            </w:r>
+          </w:p>
+        </w:tc>
+        <w:tc>
+          <w:tcPr>
+            <w:tcW w:w="2200" w:type="dxa"/>
+            <w:tcMar>
+              <w:top w:w="20" w:type="dxa"/>
+              <w:left w:w="20" w:type="dxa"/>
+              <w:bottom w:w="20" w:type="dxa"/>
+              <w:right w:w="20" w:type="dxa"/>
+            </w:tcMar>
+          </w:tcPr>
+          <w:p>
+            <w:pPr>
+              <w:spacing w:after="0" w:line="120" w:lineRule="exact"/>
+            </w:pPr>
+            <w:r>
+              <w:rPr>
+                <w:rFonts w:ascii="Arial Narrow" w:hAnsi="Arial Narrow" w:cs="Arial Narrow"/>
+                <w:sz w:val="14"/>
+                <w:szCs w:val="14"/>
+              </w:rPr>
+              <w:t xml:space="preserve">-0.714 (&lt;0.001)</w:t>
             </w:r>
           </w:p>
         </w:tc>
@@ -2345,7 +2358,7 @@
                 <w:sz w:val="14"/>
                 <w:szCs w:val="14"/>
               </w:rPr>
-              <w:t xml:space="preserve">Disabled under Equality Act</w:t>
+              <w:t xml:space="preserve">ASMR, male</w:t>
             </w:r>
           </w:p>
         </w:tc>
@@ -2417,103 +2430,103 @@
                 <w:sz w:val="14"/>
                 <w:szCs w:val="14"/>
               </w:rPr>
-              <w:t xml:space="preserve">0.081 (0.063)</w:t>
-            </w:r>
-          </w:p>
-        </w:tc>
-        <w:tc>
-          <w:tcPr>
-            <w:tcW w:w="2200" w:type="dxa"/>
-            <w:tcMar>
-              <w:top w:w="20" w:type="dxa"/>
-              <w:left w:w="20" w:type="dxa"/>
-              <w:bottom w:w="20" w:type="dxa"/>
-              <w:right w:w="20" w:type="dxa"/>
-            </w:tcMar>
-          </w:tcPr>
-          <w:p>
-            <w:pPr>
-              <w:spacing w:after="0" w:line="120" w:lineRule="exact"/>
-            </w:pPr>
-            <w:r>
-              <w:rPr>
-                <w:rFonts w:ascii="Arial Narrow" w:hAnsi="Arial Narrow" w:cs="Arial Narrow"/>
-                <w:sz w:val="14"/>
-                <w:szCs w:val="14"/>
-              </w:rPr>
-              <w:t xml:space="preserve">0.028 (0.52)</w:t>
-            </w:r>
-          </w:p>
-        </w:tc>
-        <w:tc>
-          <w:tcPr>
-            <w:tcW w:w="2200" w:type="dxa"/>
-            <w:tcMar>
-              <w:top w:w="20" w:type="dxa"/>
-              <w:left w:w="20" w:type="dxa"/>
-              <w:bottom w:w="20" w:type="dxa"/>
-              <w:right w:w="20" w:type="dxa"/>
-            </w:tcMar>
-          </w:tcPr>
-          <w:p>
-            <w:pPr>
-              <w:spacing w:after="0" w:line="120" w:lineRule="exact"/>
-            </w:pPr>
-            <w:r>
-              <w:rPr>
-                <w:rFonts w:ascii="Arial Narrow" w:hAnsi="Arial Narrow" w:cs="Arial Narrow"/>
-                <w:sz w:val="14"/>
-                <w:szCs w:val="14"/>
-              </w:rPr>
-              <w:t xml:space="preserve">-0.346 (&lt;0.001)</w:t>
-            </w:r>
-          </w:p>
-        </w:tc>
-        <w:tc>
-          <w:tcPr>
-            <w:tcW w:w="2200" w:type="dxa"/>
-            <w:tcMar>
-              <w:top w:w="20" w:type="dxa"/>
-              <w:left w:w="20" w:type="dxa"/>
-              <w:bottom w:w="20" w:type="dxa"/>
-              <w:right w:w="20" w:type="dxa"/>
-            </w:tcMar>
-          </w:tcPr>
-          <w:p>
-            <w:pPr>
-              <w:spacing w:after="0" w:line="120" w:lineRule="exact"/>
-            </w:pPr>
-            <w:r>
-              <w:rPr>
-                <w:rFonts w:ascii="Arial Narrow" w:hAnsi="Arial Narrow" w:cs="Arial Narrow"/>
-                <w:sz w:val="14"/>
-                <w:szCs w:val="14"/>
-              </w:rPr>
-              <w:t xml:space="preserve">0.399 (&lt;0.001)</w:t>
-            </w:r>
-          </w:p>
-        </w:tc>
-        <w:tc>
-          <w:tcPr>
-            <w:tcW w:w="2200" w:type="dxa"/>
-            <w:tcMar>
-              <w:top w:w="20" w:type="dxa"/>
-              <w:left w:w="20" w:type="dxa"/>
-              <w:bottom w:w="20" w:type="dxa"/>
-              <w:right w:w="20" w:type="dxa"/>
-            </w:tcMar>
-          </w:tcPr>
-          <w:p>
-            <w:pPr>
-              <w:spacing w:after="0" w:line="120" w:lineRule="exact"/>
-            </w:pPr>
-            <w:r>
-              <w:rPr>
-                <w:rFonts w:ascii="Arial Narrow" w:hAnsi="Arial Narrow" w:cs="Arial Narrow"/>
-                <w:sz w:val="14"/>
-                <w:szCs w:val="14"/>
-              </w:rPr>
-              <w:t xml:space="preserve">-0.336 (&lt;0.001)</w:t>
+              <w:t xml:space="preserve">-0.434 (&lt;0.001)</w:t>
+            </w:r>
+          </w:p>
+        </w:tc>
+        <w:tc>
+          <w:tcPr>
+            <w:tcW w:w="2200" w:type="dxa"/>
+            <w:tcMar>
+              <w:top w:w="20" w:type="dxa"/>
+              <w:left w:w="20" w:type="dxa"/>
+              <w:bottom w:w="20" w:type="dxa"/>
+              <w:right w:w="20" w:type="dxa"/>
+            </w:tcMar>
+          </w:tcPr>
+          <w:p>
+            <w:pPr>
+              <w:spacing w:after="0" w:line="120" w:lineRule="exact"/>
+            </w:pPr>
+            <w:r>
+              <w:rPr>
+                <w:rFonts w:ascii="Arial Narrow" w:hAnsi="Arial Narrow" w:cs="Arial Narrow"/>
+                <w:sz w:val="14"/>
+                <w:szCs w:val="14"/>
+              </w:rPr>
+              <w:t xml:space="preserve">0.576 (&lt;0.001)</w:t>
+            </w:r>
+          </w:p>
+        </w:tc>
+        <w:tc>
+          <w:tcPr>
+            <w:tcW w:w="2200" w:type="dxa"/>
+            <w:tcMar>
+              <w:top w:w="20" w:type="dxa"/>
+              <w:left w:w="20" w:type="dxa"/>
+              <w:bottom w:w="20" w:type="dxa"/>
+              <w:right w:w="20" w:type="dxa"/>
+            </w:tcMar>
+          </w:tcPr>
+          <w:p>
+            <w:pPr>
+              <w:spacing w:after="0" w:line="120" w:lineRule="exact"/>
+            </w:pPr>
+            <w:r>
+              <w:rPr>
+                <w:rFonts w:ascii="Arial Narrow" w:hAnsi="Arial Narrow" w:cs="Arial Narrow"/>
+                <w:sz w:val="14"/>
+                <w:szCs w:val="14"/>
+              </w:rPr>
+              <w:t xml:space="preserve">-0.523 (&lt;0.001)</w:t>
+            </w:r>
+          </w:p>
+        </w:tc>
+        <w:tc>
+          <w:tcPr>
+            <w:tcW w:w="2200" w:type="dxa"/>
+            <w:tcMar>
+              <w:top w:w="20" w:type="dxa"/>
+              <w:left w:w="20" w:type="dxa"/>
+              <w:bottom w:w="20" w:type="dxa"/>
+              <w:right w:w="20" w:type="dxa"/>
+            </w:tcMar>
+          </w:tcPr>
+          <w:p>
+            <w:pPr>
+              <w:spacing w:after="0" w:line="120" w:lineRule="exact"/>
+            </w:pPr>
+            <w:r>
+              <w:rPr>
+                <w:rFonts w:ascii="Arial Narrow" w:hAnsi="Arial Narrow" w:cs="Arial Narrow"/>
+                <w:sz w:val="14"/>
+                <w:szCs w:val="14"/>
+              </w:rPr>
+              <w:t xml:space="preserve">0.549 (&lt;0.001)</w:t>
+            </w:r>
+          </w:p>
+        </w:tc>
+        <w:tc>
+          <w:tcPr>
+            <w:tcW w:w="2200" w:type="dxa"/>
+            <w:tcMar>
+              <w:top w:w="20" w:type="dxa"/>
+              <w:left w:w="20" w:type="dxa"/>
+              <w:bottom w:w="20" w:type="dxa"/>
+              <w:right w:w="20" w:type="dxa"/>
+            </w:tcMar>
+          </w:tcPr>
+          <w:p>
+            <w:pPr>
+              <w:spacing w:after="0" w:line="120" w:lineRule="exact"/>
+            </w:pPr>
+            <w:r>
+              <w:rPr>
+                <w:rFonts w:ascii="Arial Narrow" w:hAnsi="Arial Narrow" w:cs="Arial Narrow"/>
+                <w:sz w:val="14"/>
+                <w:szCs w:val="14"/>
+              </w:rPr>
+              <w:t xml:space="preserve">-0.746 (&lt;0.001)</w:t>
             </w:r>
           </w:p>
         </w:tc>
@@ -2566,7 +2579,7 @@
                 <w:sz w:val="14"/>
                 <w:szCs w:val="14"/>
               </w:rPr>
-              <w:t xml:space="preserve">Any unpaid care</w:t>
+              <w:t xml:space="preserve">Not good health</w:t>
             </w:r>
           </w:p>
         </w:tc>
@@ -2638,103 +2651,103 @@
                 <w:sz w:val="14"/>
                 <w:szCs w:val="14"/>
               </w:rPr>
-              <w:t xml:space="preserve">0.330 (&lt;0.001)</w:t>
-            </w:r>
-          </w:p>
-        </w:tc>
-        <w:tc>
-          <w:tcPr>
-            <w:tcW w:w="2200" w:type="dxa"/>
-            <w:tcMar>
-              <w:top w:w="20" w:type="dxa"/>
-              <w:left w:w="20" w:type="dxa"/>
-              <w:bottom w:w="20" w:type="dxa"/>
-              <w:right w:w="20" w:type="dxa"/>
-            </w:tcMar>
-          </w:tcPr>
-          <w:p>
-            <w:pPr>
-              <w:spacing w:after="0" w:line="120" w:lineRule="exact"/>
-            </w:pPr>
-            <w:r>
-              <w:rPr>
-                <w:rFonts w:ascii="Arial Narrow" w:hAnsi="Arial Narrow" w:cs="Arial Narrow"/>
-                <w:sz w:val="14"/>
-                <w:szCs w:val="14"/>
-              </w:rPr>
-              <w:t xml:space="preserve">-0.200 (&lt;0.001)</w:t>
-            </w:r>
-          </w:p>
-        </w:tc>
-        <w:tc>
-          <w:tcPr>
-            <w:tcW w:w="2200" w:type="dxa"/>
-            <w:tcMar>
-              <w:top w:w="20" w:type="dxa"/>
-              <w:left w:w="20" w:type="dxa"/>
-              <w:bottom w:w="20" w:type="dxa"/>
-              <w:right w:w="20" w:type="dxa"/>
-            </w:tcMar>
-          </w:tcPr>
-          <w:p>
-            <w:pPr>
-              <w:spacing w:after="0" w:line="120" w:lineRule="exact"/>
-            </w:pPr>
-            <w:r>
-              <w:rPr>
-                <w:rFonts w:ascii="Arial Narrow" w:hAnsi="Arial Narrow" w:cs="Arial Narrow"/>
-                <w:sz w:val="14"/>
-                <w:szCs w:val="14"/>
-              </w:rPr>
-              <w:t xml:space="preserve">-0.269 (&lt;0.001)</w:t>
-            </w:r>
-          </w:p>
-        </w:tc>
-        <w:tc>
-          <w:tcPr>
-            <w:tcW w:w="2200" w:type="dxa"/>
-            <w:tcMar>
-              <w:top w:w="20" w:type="dxa"/>
-              <w:left w:w="20" w:type="dxa"/>
-              <w:bottom w:w="20" w:type="dxa"/>
-              <w:right w:w="20" w:type="dxa"/>
-            </w:tcMar>
-          </w:tcPr>
-          <w:p>
-            <w:pPr>
-              <w:spacing w:after="0" w:line="120" w:lineRule="exact"/>
-            </w:pPr>
-            <w:r>
-              <w:rPr>
-                <w:rFonts w:ascii="Arial Narrow" w:hAnsi="Arial Narrow" w:cs="Arial Narrow"/>
-                <w:sz w:val="14"/>
-                <w:szCs w:val="14"/>
-              </w:rPr>
-              <w:t xml:space="preserve">0.273 (&lt;0.001)</w:t>
-            </w:r>
-          </w:p>
-        </w:tc>
-        <w:tc>
-          <w:tcPr>
-            <w:tcW w:w="2200" w:type="dxa"/>
-            <w:tcMar>
-              <w:top w:w="20" w:type="dxa"/>
-              <w:left w:w="20" w:type="dxa"/>
-              <w:bottom w:w="20" w:type="dxa"/>
-              <w:right w:w="20" w:type="dxa"/>
-            </w:tcMar>
-          </w:tcPr>
-          <w:p>
-            <w:pPr>
-              <w:spacing w:after="0" w:line="120" w:lineRule="exact"/>
-            </w:pPr>
-            <w:r>
-              <w:rPr>
-                <w:rFonts w:ascii="Arial Narrow" w:hAnsi="Arial Narrow" w:cs="Arial Narrow"/>
-                <w:sz w:val="14"/>
-                <w:szCs w:val="14"/>
-              </w:rPr>
-              <w:t xml:space="preserve">-0.131 (0.002)</w:t>
+              <w:t xml:space="preserve">0.035 (0.416)</w:t>
+            </w:r>
+          </w:p>
+        </w:tc>
+        <w:tc>
+          <w:tcPr>
+            <w:tcW w:w="2200" w:type="dxa"/>
+            <w:tcMar>
+              <w:top w:w="20" w:type="dxa"/>
+              <w:left w:w="20" w:type="dxa"/>
+              <w:bottom w:w="20" w:type="dxa"/>
+              <w:right w:w="20" w:type="dxa"/>
+            </w:tcMar>
+          </w:tcPr>
+          <w:p>
+            <w:pPr>
+              <w:spacing w:after="0" w:line="120" w:lineRule="exact"/>
+            </w:pPr>
+            <w:r>
+              <w:rPr>
+                <w:rFonts w:ascii="Arial Narrow" w:hAnsi="Arial Narrow" w:cs="Arial Narrow"/>
+                <w:sz w:val="14"/>
+                <w:szCs w:val="14"/>
+              </w:rPr>
+              <w:t xml:space="preserve">0.145 (&lt;0.001)</w:t>
+            </w:r>
+          </w:p>
+        </w:tc>
+        <w:tc>
+          <w:tcPr>
+            <w:tcW w:w="2200" w:type="dxa"/>
+            <w:tcMar>
+              <w:top w:w="20" w:type="dxa"/>
+              <w:left w:w="20" w:type="dxa"/>
+              <w:bottom w:w="20" w:type="dxa"/>
+              <w:right w:w="20" w:type="dxa"/>
+            </w:tcMar>
+          </w:tcPr>
+          <w:p>
+            <w:pPr>
+              <w:spacing w:after="0" w:line="120" w:lineRule="exact"/>
+            </w:pPr>
+            <w:r>
+              <w:rPr>
+                <w:rFonts w:ascii="Arial Narrow" w:hAnsi="Arial Narrow" w:cs="Arial Narrow"/>
+                <w:sz w:val="14"/>
+                <w:szCs w:val="14"/>
+              </w:rPr>
+              <w:t xml:space="preserve">-0.477 (&lt;0.001)</w:t>
+            </w:r>
+          </w:p>
+        </w:tc>
+        <w:tc>
+          <w:tcPr>
+            <w:tcW w:w="2200" w:type="dxa"/>
+            <w:tcMar>
+              <w:top w:w="20" w:type="dxa"/>
+              <w:left w:w="20" w:type="dxa"/>
+              <w:bottom w:w="20" w:type="dxa"/>
+              <w:right w:w="20" w:type="dxa"/>
+            </w:tcMar>
+          </w:tcPr>
+          <w:p>
+            <w:pPr>
+              <w:spacing w:after="0" w:line="120" w:lineRule="exact"/>
+            </w:pPr>
+            <w:r>
+              <w:rPr>
+                <w:rFonts w:ascii="Arial Narrow" w:hAnsi="Arial Narrow" w:cs="Arial Narrow"/>
+                <w:sz w:val="14"/>
+                <w:szCs w:val="14"/>
+              </w:rPr>
+              <w:t xml:space="preserve">0.469 (&lt;0.001)</w:t>
+            </w:r>
+          </w:p>
+        </w:tc>
+        <w:tc>
+          <w:tcPr>
+            <w:tcW w:w="2200" w:type="dxa"/>
+            <w:tcMar>
+              <w:top w:w="20" w:type="dxa"/>
+              <w:left w:w="20" w:type="dxa"/>
+              <w:bottom w:w="20" w:type="dxa"/>
+              <w:right w:w="20" w:type="dxa"/>
+            </w:tcMar>
+          </w:tcPr>
+          <w:p>
+            <w:pPr>
+              <w:spacing w:after="0" w:line="120" w:lineRule="exact"/>
+            </w:pPr>
+            <w:r>
+              <w:rPr>
+                <w:rFonts w:ascii="Arial Narrow" w:hAnsi="Arial Narrow" w:cs="Arial Narrow"/>
+                <w:sz w:val="14"/>
+                <w:szCs w:val="14"/>
+              </w:rPr>
+              <w:t xml:space="preserve">-0.532 (&lt;0.001)</w:t>
             </w:r>
           </w:p>
         </w:tc>
@@ -2787,6 +2800,448 @@
                 <w:sz w:val="14"/>
                 <w:szCs w:val="14"/>
               </w:rPr>
+              <w:t xml:space="preserve">Disabled under Equality Act</w:t>
+            </w:r>
+          </w:p>
+        </w:tc>
+        <w:tc>
+          <w:tcPr>
+            <w:tcW w:w="650" w:type="dxa"/>
+            <w:tcMar>
+              <w:top w:w="20" w:type="dxa"/>
+              <w:left w:w="20" w:type="dxa"/>
+              <w:bottom w:w="20" w:type="dxa"/>
+              <w:right w:w="20" w:type="dxa"/>
+            </w:tcMar>
+          </w:tcPr>
+          <w:p>
+            <w:pPr>
+              <w:spacing w:after="0" w:line="120" w:lineRule="exact"/>
+            </w:pPr>
+            <w:r>
+              <w:rPr>
+                <w:rFonts w:ascii="Arial Narrow" w:hAnsi="Arial Narrow" w:cs="Arial Narrow"/>
+                <w:sz w:val="14"/>
+                <w:szCs w:val="14"/>
+              </w:rPr>
+              <w:t xml:space="preserve">2019</w:t>
+            </w:r>
+          </w:p>
+        </w:tc>
+        <w:tc>
+          <w:tcPr>
+            <w:tcW w:w="500" w:type="dxa"/>
+            <w:tcMar>
+              <w:top w:w="20" w:type="dxa"/>
+              <w:left w:w="20" w:type="dxa"/>
+              <w:bottom w:w="20" w:type="dxa"/>
+              <w:right w:w="20" w:type="dxa"/>
+            </w:tcMar>
+          </w:tcPr>
+          <w:p>
+            <w:pPr>
+              <w:spacing w:after="0" w:line="120" w:lineRule="exact"/>
+            </w:pPr>
+            <w:r>
+              <w:rPr>
+                <w:rFonts w:ascii="Arial Narrow" w:hAnsi="Arial Narrow" w:cs="Arial Narrow"/>
+                <w:sz w:val="14"/>
+                <w:szCs w:val="14"/>
+              </w:rPr>
+              <w:t xml:space="preserve">532</w:t>
+            </w:r>
+          </w:p>
+        </w:tc>
+        <w:tc>
+          <w:tcPr>
+            <w:tcW w:w="2200" w:type="dxa"/>
+            <w:tcMar>
+              <w:top w:w="20" w:type="dxa"/>
+              <w:left w:w="20" w:type="dxa"/>
+              <w:bottom w:w="20" w:type="dxa"/>
+              <w:right w:w="20" w:type="dxa"/>
+            </w:tcMar>
+          </w:tcPr>
+          <w:p>
+            <w:pPr>
+              <w:spacing w:after="0" w:line="120" w:lineRule="exact"/>
+            </w:pPr>
+            <w:r>
+              <w:rPr>
+                <w:rFonts w:ascii="Arial Narrow" w:hAnsi="Arial Narrow" w:cs="Arial Narrow"/>
+                <w:sz w:val="14"/>
+                <w:szCs w:val="14"/>
+              </w:rPr>
+              <w:t xml:space="preserve">0.081 (0.063)</w:t>
+            </w:r>
+          </w:p>
+        </w:tc>
+        <w:tc>
+          <w:tcPr>
+            <w:tcW w:w="2200" w:type="dxa"/>
+            <w:tcMar>
+              <w:top w:w="20" w:type="dxa"/>
+              <w:left w:w="20" w:type="dxa"/>
+              <w:bottom w:w="20" w:type="dxa"/>
+              <w:right w:w="20" w:type="dxa"/>
+            </w:tcMar>
+          </w:tcPr>
+          <w:p>
+            <w:pPr>
+              <w:spacing w:after="0" w:line="120" w:lineRule="exact"/>
+            </w:pPr>
+            <w:r>
+              <w:rPr>
+                <w:rFonts w:ascii="Arial Narrow" w:hAnsi="Arial Narrow" w:cs="Arial Narrow"/>
+                <w:sz w:val="14"/>
+                <w:szCs w:val="14"/>
+              </w:rPr>
+              <w:t xml:space="preserve">0.028 (0.52)</w:t>
+            </w:r>
+          </w:p>
+        </w:tc>
+        <w:tc>
+          <w:tcPr>
+            <w:tcW w:w="2200" w:type="dxa"/>
+            <w:tcMar>
+              <w:top w:w="20" w:type="dxa"/>
+              <w:left w:w="20" w:type="dxa"/>
+              <w:bottom w:w="20" w:type="dxa"/>
+              <w:right w:w="20" w:type="dxa"/>
+            </w:tcMar>
+          </w:tcPr>
+          <w:p>
+            <w:pPr>
+              <w:spacing w:after="0" w:line="120" w:lineRule="exact"/>
+            </w:pPr>
+            <w:r>
+              <w:rPr>
+                <w:rFonts w:ascii="Arial Narrow" w:hAnsi="Arial Narrow" w:cs="Arial Narrow"/>
+                <w:sz w:val="14"/>
+                <w:szCs w:val="14"/>
+              </w:rPr>
+              <w:t xml:space="preserve">-0.346 (&lt;0.001)</w:t>
+            </w:r>
+          </w:p>
+        </w:tc>
+        <w:tc>
+          <w:tcPr>
+            <w:tcW w:w="2200" w:type="dxa"/>
+            <w:tcMar>
+              <w:top w:w="20" w:type="dxa"/>
+              <w:left w:w="20" w:type="dxa"/>
+              <w:bottom w:w="20" w:type="dxa"/>
+              <w:right w:w="20" w:type="dxa"/>
+            </w:tcMar>
+          </w:tcPr>
+          <w:p>
+            <w:pPr>
+              <w:spacing w:after="0" w:line="120" w:lineRule="exact"/>
+            </w:pPr>
+            <w:r>
+              <w:rPr>
+                <w:rFonts w:ascii="Arial Narrow" w:hAnsi="Arial Narrow" w:cs="Arial Narrow"/>
+                <w:sz w:val="14"/>
+                <w:szCs w:val="14"/>
+              </w:rPr>
+              <w:t xml:space="preserve">0.399 (&lt;0.001)</w:t>
+            </w:r>
+          </w:p>
+        </w:tc>
+        <w:tc>
+          <w:tcPr>
+            <w:tcW w:w="2200" w:type="dxa"/>
+            <w:tcMar>
+              <w:top w:w="20" w:type="dxa"/>
+              <w:left w:w="20" w:type="dxa"/>
+              <w:bottom w:w="20" w:type="dxa"/>
+              <w:right w:w="20" w:type="dxa"/>
+            </w:tcMar>
+          </w:tcPr>
+          <w:p>
+            <w:pPr>
+              <w:spacing w:after="0" w:line="120" w:lineRule="exact"/>
+            </w:pPr>
+            <w:r>
+              <w:rPr>
+                <w:rFonts w:ascii="Arial Narrow" w:hAnsi="Arial Narrow" w:cs="Arial Narrow"/>
+                <w:sz w:val="14"/>
+                <w:szCs w:val="14"/>
+              </w:rPr>
+              <w:t xml:space="preserve">-0.336 (&lt;0.001)</w:t>
+            </w:r>
+          </w:p>
+        </w:tc>
+      </w:tr>
+      <w:tr>
+        <w:trPr>
+          <w:trHeight w:val="180" w:hRule="atLeast"/>
+        </w:trPr>
+        <w:tc>
+          <w:tcPr>
+            <w:tcW w:w="900" w:type="dxa"/>
+            <w:tcMar>
+              <w:top w:w="20" w:type="dxa"/>
+              <w:left w:w="20" w:type="dxa"/>
+              <w:bottom w:w="20" w:type="dxa"/>
+              <w:right w:w="20" w:type="dxa"/>
+            </w:tcMar>
+          </w:tcPr>
+          <w:p>
+            <w:pPr>
+              <w:spacing w:after="0" w:line="120" w:lineRule="exact"/>
+            </w:pPr>
+            <w:r>
+              <w:rPr>
+                <w:rFonts w:ascii="Arial Narrow" w:hAnsi="Arial Narrow" w:cs="Arial Narrow"/>
+                <w:sz w:val="14"/>
+                <w:szCs w:val="14"/>
+              </w:rPr>
+              <w:t xml:space="preserve">Pearson</w:t>
+            </w:r>
+          </w:p>
+        </w:tc>
+        <w:tc>
+          <w:tcPr>
+            <w:tcW w:w="3300" w:type="dxa"/>
+            <w:tcMar>
+              <w:top w:w="20" w:type="dxa"/>
+              <w:left w:w="20" w:type="dxa"/>
+              <w:bottom w:w="20" w:type="dxa"/>
+              <w:right w:w="20" w:type="dxa"/>
+            </w:tcMar>
+          </w:tcPr>
+          <w:p>
+            <w:pPr>
+              <w:spacing w:after="0" w:line="120" w:lineRule="exact"/>
+            </w:pPr>
+            <w:r>
+              <w:rPr>
+                <w:rFonts w:ascii="Arial Narrow" w:hAnsi="Arial Narrow" w:cs="Arial Narrow"/>
+                <w:sz w:val="14"/>
+                <w:szCs w:val="14"/>
+              </w:rPr>
+              <w:t xml:space="preserve">Any unpaid care</w:t>
+            </w:r>
+          </w:p>
+        </w:tc>
+        <w:tc>
+          <w:tcPr>
+            <w:tcW w:w="650" w:type="dxa"/>
+            <w:tcMar>
+              <w:top w:w="20" w:type="dxa"/>
+              <w:left w:w="20" w:type="dxa"/>
+              <w:bottom w:w="20" w:type="dxa"/>
+              <w:right w:w="20" w:type="dxa"/>
+            </w:tcMar>
+          </w:tcPr>
+          <w:p>
+            <w:pPr>
+              <w:spacing w:after="0" w:line="120" w:lineRule="exact"/>
+            </w:pPr>
+            <w:r>
+              <w:rPr>
+                <w:rFonts w:ascii="Arial Narrow" w:hAnsi="Arial Narrow" w:cs="Arial Narrow"/>
+                <w:sz w:val="14"/>
+                <w:szCs w:val="14"/>
+              </w:rPr>
+              <w:t xml:space="preserve">2019</w:t>
+            </w:r>
+          </w:p>
+        </w:tc>
+        <w:tc>
+          <w:tcPr>
+            <w:tcW w:w="500" w:type="dxa"/>
+            <w:tcMar>
+              <w:top w:w="20" w:type="dxa"/>
+              <w:left w:w="20" w:type="dxa"/>
+              <w:bottom w:w="20" w:type="dxa"/>
+              <w:right w:w="20" w:type="dxa"/>
+            </w:tcMar>
+          </w:tcPr>
+          <w:p>
+            <w:pPr>
+              <w:spacing w:after="0" w:line="120" w:lineRule="exact"/>
+            </w:pPr>
+            <w:r>
+              <w:rPr>
+                <w:rFonts w:ascii="Arial Narrow" w:hAnsi="Arial Narrow" w:cs="Arial Narrow"/>
+                <w:sz w:val="14"/>
+                <w:szCs w:val="14"/>
+              </w:rPr>
+              <w:t xml:space="preserve">532</w:t>
+            </w:r>
+          </w:p>
+        </w:tc>
+        <w:tc>
+          <w:tcPr>
+            <w:tcW w:w="2200" w:type="dxa"/>
+            <w:tcMar>
+              <w:top w:w="20" w:type="dxa"/>
+              <w:left w:w="20" w:type="dxa"/>
+              <w:bottom w:w="20" w:type="dxa"/>
+              <w:right w:w="20" w:type="dxa"/>
+            </w:tcMar>
+          </w:tcPr>
+          <w:p>
+            <w:pPr>
+              <w:spacing w:after="0" w:line="120" w:lineRule="exact"/>
+            </w:pPr>
+            <w:r>
+              <w:rPr>
+                <w:rFonts w:ascii="Arial Narrow" w:hAnsi="Arial Narrow" w:cs="Arial Narrow"/>
+                <w:sz w:val="14"/>
+                <w:szCs w:val="14"/>
+              </w:rPr>
+              <w:t xml:space="preserve">0.330 (&lt;0.001)</w:t>
+            </w:r>
+          </w:p>
+        </w:tc>
+        <w:tc>
+          <w:tcPr>
+            <w:tcW w:w="2200" w:type="dxa"/>
+            <w:tcMar>
+              <w:top w:w="20" w:type="dxa"/>
+              <w:left w:w="20" w:type="dxa"/>
+              <w:bottom w:w="20" w:type="dxa"/>
+              <w:right w:w="20" w:type="dxa"/>
+            </w:tcMar>
+          </w:tcPr>
+          <w:p>
+            <w:pPr>
+              <w:spacing w:after="0" w:line="120" w:lineRule="exact"/>
+            </w:pPr>
+            <w:r>
+              <w:rPr>
+                <w:rFonts w:ascii="Arial Narrow" w:hAnsi="Arial Narrow" w:cs="Arial Narrow"/>
+                <w:sz w:val="14"/>
+                <w:szCs w:val="14"/>
+              </w:rPr>
+              <w:t xml:space="preserve">-0.200 (&lt;0.001)</w:t>
+            </w:r>
+          </w:p>
+        </w:tc>
+        <w:tc>
+          <w:tcPr>
+            <w:tcW w:w="2200" w:type="dxa"/>
+            <w:tcMar>
+              <w:top w:w="20" w:type="dxa"/>
+              <w:left w:w="20" w:type="dxa"/>
+              <w:bottom w:w="20" w:type="dxa"/>
+              <w:right w:w="20" w:type="dxa"/>
+            </w:tcMar>
+          </w:tcPr>
+          <w:p>
+            <w:pPr>
+              <w:spacing w:after="0" w:line="120" w:lineRule="exact"/>
+            </w:pPr>
+            <w:r>
+              <w:rPr>
+                <w:rFonts w:ascii="Arial Narrow" w:hAnsi="Arial Narrow" w:cs="Arial Narrow"/>
+                <w:sz w:val="14"/>
+                <w:szCs w:val="14"/>
+              </w:rPr>
+              <w:t xml:space="preserve">-0.269 (&lt;0.001)</w:t>
+            </w:r>
+          </w:p>
+        </w:tc>
+        <w:tc>
+          <w:tcPr>
+            <w:tcW w:w="2200" w:type="dxa"/>
+            <w:tcMar>
+              <w:top w:w="20" w:type="dxa"/>
+              <w:left w:w="20" w:type="dxa"/>
+              <w:bottom w:w="20" w:type="dxa"/>
+              <w:right w:w="20" w:type="dxa"/>
+            </w:tcMar>
+          </w:tcPr>
+          <w:p>
+            <w:pPr>
+              <w:spacing w:after="0" w:line="120" w:lineRule="exact"/>
+            </w:pPr>
+            <w:r>
+              <w:rPr>
+                <w:rFonts w:ascii="Arial Narrow" w:hAnsi="Arial Narrow" w:cs="Arial Narrow"/>
+                <w:sz w:val="14"/>
+                <w:szCs w:val="14"/>
+              </w:rPr>
+              <w:t xml:space="preserve">0.273 (&lt;0.001)</w:t>
+            </w:r>
+          </w:p>
+        </w:tc>
+        <w:tc>
+          <w:tcPr>
+            <w:tcW w:w="2200" w:type="dxa"/>
+            <w:tcMar>
+              <w:top w:w="20" w:type="dxa"/>
+              <w:left w:w="20" w:type="dxa"/>
+              <w:bottom w:w="20" w:type="dxa"/>
+              <w:right w:w="20" w:type="dxa"/>
+            </w:tcMar>
+          </w:tcPr>
+          <w:p>
+            <w:pPr>
+              <w:spacing w:after="0" w:line="120" w:lineRule="exact"/>
+            </w:pPr>
+            <w:r>
+              <w:rPr>
+                <w:rFonts w:ascii="Arial Narrow" w:hAnsi="Arial Narrow" w:cs="Arial Narrow"/>
+                <w:sz w:val="14"/>
+                <w:szCs w:val="14"/>
+              </w:rPr>
+              <w:t xml:space="preserve">-0.131 (0.002)</w:t>
+            </w:r>
+          </w:p>
+        </w:tc>
+      </w:tr>
+      <w:tr>
+        <w:trPr>
+          <w:trHeight w:val="180" w:hRule="atLeast"/>
+        </w:trPr>
+        <w:tc>
+          <w:tcPr>
+            <w:tcW w:w="900" w:type="dxa"/>
+            <w:tcMar>
+              <w:top w:w="20" w:type="dxa"/>
+              <w:left w:w="20" w:type="dxa"/>
+              <w:bottom w:w="20" w:type="dxa"/>
+              <w:right w:w="20" w:type="dxa"/>
+            </w:tcMar>
+          </w:tcPr>
+          <w:p>
+            <w:pPr>
+              <w:spacing w:after="0" w:line="120" w:lineRule="exact"/>
+            </w:pPr>
+            <w:r>
+              <w:rPr>
+                <w:rFonts w:ascii="Arial Narrow" w:hAnsi="Arial Narrow" w:cs="Arial Narrow"/>
+                <w:sz w:val="14"/>
+                <w:szCs w:val="14"/>
+              </w:rPr>
+              <w:t xml:space="preserve">Pearson</w:t>
+            </w:r>
+          </w:p>
+        </w:tc>
+        <w:tc>
+          <w:tcPr>
+            <w:tcW w:w="3300" w:type="dxa"/>
+            <w:tcMar>
+              <w:top w:w="20" w:type="dxa"/>
+              <w:left w:w="20" w:type="dxa"/>
+              <w:bottom w:w="20" w:type="dxa"/>
+              <w:right w:w="20" w:type="dxa"/>
+            </w:tcMar>
+          </w:tcPr>
+          <w:p>
+            <w:pPr>
+              <w:spacing w:after="0" w:line="120" w:lineRule="exact"/>
+            </w:pPr>
+            <w:r>
+              <w:rPr>
+                <w:rFonts w:ascii="Arial Narrow" w:hAnsi="Arial Narrow" w:cs="Arial Narrow"/>
+                <w:sz w:val="14"/>
+                <w:szCs w:val="14"/>
+              </w:rPr>
               <w:t xml:space="preserve">Health Deprivation and Disability rank</w:t>
             </w:r>
           </w:p>
@@ -2956,6 +3411,448 @@
                 <w:szCs w:val="14"/>
               </w:rPr>
               <w:t xml:space="preserve">0.717 (&lt;0.001)</w:t>
+            </w:r>
+          </w:p>
+        </w:tc>
+      </w:tr>
+      <w:tr>
+        <w:trPr>
+          <w:trHeight w:val="180" w:hRule="atLeast"/>
+        </w:trPr>
+        <w:tc>
+          <w:tcPr>
+            <w:tcW w:w="900" w:type="dxa"/>
+            <w:tcMar>
+              <w:top w:w="20" w:type="dxa"/>
+              <w:left w:w="20" w:type="dxa"/>
+              <w:bottom w:w="20" w:type="dxa"/>
+              <w:right w:w="20" w:type="dxa"/>
+            </w:tcMar>
+          </w:tcPr>
+          <w:p>
+            <w:pPr>
+              <w:spacing w:after="0" w:line="120" w:lineRule="exact"/>
+            </w:pPr>
+            <w:r>
+              <w:rPr>
+                <w:rFonts w:ascii="Arial Narrow" w:hAnsi="Arial Narrow" w:cs="Arial Narrow"/>
+                <w:sz w:val="14"/>
+                <w:szCs w:val="14"/>
+              </w:rPr>
+              <w:t xml:space="preserve">Pearson</w:t>
+            </w:r>
+          </w:p>
+        </w:tc>
+        <w:tc>
+          <w:tcPr>
+            <w:tcW w:w="3300" w:type="dxa"/>
+            <w:tcMar>
+              <w:top w:w="20" w:type="dxa"/>
+              <w:left w:w="20" w:type="dxa"/>
+              <w:bottom w:w="20" w:type="dxa"/>
+              <w:right w:w="20" w:type="dxa"/>
+            </w:tcMar>
+          </w:tcPr>
+          <w:p>
+            <w:pPr>
+              <w:spacing w:after="0" w:line="120" w:lineRule="exact"/>
+            </w:pPr>
+            <w:r>
+              <w:rPr>
+                <w:rFonts w:ascii="Arial Narrow" w:hAnsi="Arial Narrow" w:cs="Arial Narrow"/>
+                <w:sz w:val="14"/>
+                <w:szCs w:val="14"/>
+              </w:rPr>
+              <w:t xml:space="preserve">Premature ASMR (2021), female</w:t>
+            </w:r>
+          </w:p>
+        </w:tc>
+        <w:tc>
+          <w:tcPr>
+            <w:tcW w:w="650" w:type="dxa"/>
+            <w:tcMar>
+              <w:top w:w="20" w:type="dxa"/>
+              <w:left w:w="20" w:type="dxa"/>
+              <w:bottom w:w="20" w:type="dxa"/>
+              <w:right w:w="20" w:type="dxa"/>
+            </w:tcMar>
+          </w:tcPr>
+          <w:p>
+            <w:pPr>
+              <w:spacing w:after="0" w:line="120" w:lineRule="exact"/>
+            </w:pPr>
+            <w:r>
+              <w:rPr>
+                <w:rFonts w:ascii="Arial Narrow" w:hAnsi="Arial Narrow" w:cs="Arial Narrow"/>
+                <w:sz w:val="14"/>
+                <w:szCs w:val="14"/>
+              </w:rPr>
+              <w:t xml:space="preserve">2019</w:t>
+            </w:r>
+          </w:p>
+        </w:tc>
+        <w:tc>
+          <w:tcPr>
+            <w:tcW w:w="500" w:type="dxa"/>
+            <w:tcMar>
+              <w:top w:w="20" w:type="dxa"/>
+              <w:left w:w="20" w:type="dxa"/>
+              <w:bottom w:w="20" w:type="dxa"/>
+              <w:right w:w="20" w:type="dxa"/>
+            </w:tcMar>
+          </w:tcPr>
+          <w:p>
+            <w:pPr>
+              <w:spacing w:after="0" w:line="120" w:lineRule="exact"/>
+            </w:pPr>
+            <w:r>
+              <w:rPr>
+                <w:rFonts w:ascii="Arial Narrow" w:hAnsi="Arial Narrow" w:cs="Arial Narrow"/>
+                <w:sz w:val="14"/>
+                <w:szCs w:val="14"/>
+              </w:rPr>
+              <w:t xml:space="preserve">532</w:t>
+            </w:r>
+          </w:p>
+        </w:tc>
+        <w:tc>
+          <w:tcPr>
+            <w:tcW w:w="2200" w:type="dxa"/>
+            <w:tcMar>
+              <w:top w:w="20" w:type="dxa"/>
+              <w:left w:w="20" w:type="dxa"/>
+              <w:bottom w:w="20" w:type="dxa"/>
+              <w:right w:w="20" w:type="dxa"/>
+            </w:tcMar>
+          </w:tcPr>
+          <w:p>
+            <w:pPr>
+              <w:spacing w:after="0" w:line="120" w:lineRule="exact"/>
+            </w:pPr>
+            <w:r>
+              <w:rPr>
+                <w:rFonts w:ascii="Arial Narrow" w:hAnsi="Arial Narrow" w:cs="Arial Narrow"/>
+                <w:sz w:val="14"/>
+                <w:szCs w:val="14"/>
+              </w:rPr>
+              <w:t xml:space="preserve">-0.489 (&lt;0.001)</w:t>
+            </w:r>
+          </w:p>
+        </w:tc>
+        <w:tc>
+          <w:tcPr>
+            <w:tcW w:w="2200" w:type="dxa"/>
+            <w:tcMar>
+              <w:top w:w="20" w:type="dxa"/>
+              <w:left w:w="20" w:type="dxa"/>
+              <w:bottom w:w="20" w:type="dxa"/>
+              <w:right w:w="20" w:type="dxa"/>
+            </w:tcMar>
+          </w:tcPr>
+          <w:p>
+            <w:pPr>
+              <w:spacing w:after="0" w:line="120" w:lineRule="exact"/>
+            </w:pPr>
+            <w:r>
+              <w:rPr>
+                <w:rFonts w:ascii="Arial Narrow" w:hAnsi="Arial Narrow" w:cs="Arial Narrow"/>
+                <w:sz w:val="14"/>
+                <w:szCs w:val="14"/>
+              </w:rPr>
+              <w:t xml:space="preserve">0.653 (&lt;0.001)</w:t>
+            </w:r>
+          </w:p>
+        </w:tc>
+        <w:tc>
+          <w:tcPr>
+            <w:tcW w:w="2200" w:type="dxa"/>
+            <w:tcMar>
+              <w:top w:w="20" w:type="dxa"/>
+              <w:left w:w="20" w:type="dxa"/>
+              <w:bottom w:w="20" w:type="dxa"/>
+              <w:right w:w="20" w:type="dxa"/>
+            </w:tcMar>
+          </w:tcPr>
+          <w:p>
+            <w:pPr>
+              <w:spacing w:after="0" w:line="120" w:lineRule="exact"/>
+            </w:pPr>
+            <w:r>
+              <w:rPr>
+                <w:rFonts w:ascii="Arial Narrow" w:hAnsi="Arial Narrow" w:cs="Arial Narrow"/>
+                <w:sz w:val="14"/>
+                <w:szCs w:val="14"/>
+              </w:rPr>
+              <w:t xml:space="preserve">-0.551 (&lt;0.001)</w:t>
+            </w:r>
+          </w:p>
+        </w:tc>
+        <w:tc>
+          <w:tcPr>
+            <w:tcW w:w="2200" w:type="dxa"/>
+            <w:tcMar>
+              <w:top w:w="20" w:type="dxa"/>
+              <w:left w:w="20" w:type="dxa"/>
+              <w:bottom w:w="20" w:type="dxa"/>
+              <w:right w:w="20" w:type="dxa"/>
+            </w:tcMar>
+          </w:tcPr>
+          <w:p>
+            <w:pPr>
+              <w:spacing w:after="0" w:line="120" w:lineRule="exact"/>
+            </w:pPr>
+            <w:r>
+              <w:rPr>
+                <w:rFonts w:ascii="Arial Narrow" w:hAnsi="Arial Narrow" w:cs="Arial Narrow"/>
+                <w:sz w:val="14"/>
+                <w:szCs w:val="14"/>
+              </w:rPr>
+              <w:t xml:space="preserve">0.546 (&lt;0.001)</w:t>
+            </w:r>
+          </w:p>
+        </w:tc>
+        <w:tc>
+          <w:tcPr>
+            <w:tcW w:w="2200" w:type="dxa"/>
+            <w:tcMar>
+              <w:top w:w="20" w:type="dxa"/>
+              <w:left w:w="20" w:type="dxa"/>
+              <w:bottom w:w="20" w:type="dxa"/>
+              <w:right w:w="20" w:type="dxa"/>
+            </w:tcMar>
+          </w:tcPr>
+          <w:p>
+            <w:pPr>
+              <w:spacing w:after="0" w:line="120" w:lineRule="exact"/>
+            </w:pPr>
+            <w:r>
+              <w:rPr>
+                <w:rFonts w:ascii="Arial Narrow" w:hAnsi="Arial Narrow" w:cs="Arial Narrow"/>
+                <w:sz w:val="14"/>
+                <w:szCs w:val="14"/>
+              </w:rPr>
+              <w:t xml:space="preserve">-0.776 (&lt;0.001)</w:t>
+            </w:r>
+          </w:p>
+        </w:tc>
+      </w:tr>
+      <w:tr>
+        <w:trPr>
+          <w:trHeight w:val="180" w:hRule="atLeast"/>
+        </w:trPr>
+        <w:tc>
+          <w:tcPr>
+            <w:tcW w:w="900" w:type="dxa"/>
+            <w:tcMar>
+              <w:top w:w="20" w:type="dxa"/>
+              <w:left w:w="20" w:type="dxa"/>
+              <w:bottom w:w="20" w:type="dxa"/>
+              <w:right w:w="20" w:type="dxa"/>
+            </w:tcMar>
+          </w:tcPr>
+          <w:p>
+            <w:pPr>
+              <w:spacing w:after="0" w:line="120" w:lineRule="exact"/>
+            </w:pPr>
+            <w:r>
+              <w:rPr>
+                <w:rFonts w:ascii="Arial Narrow" w:hAnsi="Arial Narrow" w:cs="Arial Narrow"/>
+                <w:sz w:val="14"/>
+                <w:szCs w:val="14"/>
+              </w:rPr>
+              <w:t xml:space="preserve">Pearson</w:t>
+            </w:r>
+          </w:p>
+        </w:tc>
+        <w:tc>
+          <w:tcPr>
+            <w:tcW w:w="3300" w:type="dxa"/>
+            <w:tcMar>
+              <w:top w:w="20" w:type="dxa"/>
+              <w:left w:w="20" w:type="dxa"/>
+              <w:bottom w:w="20" w:type="dxa"/>
+              <w:right w:w="20" w:type="dxa"/>
+            </w:tcMar>
+          </w:tcPr>
+          <w:p>
+            <w:pPr>
+              <w:spacing w:after="0" w:line="120" w:lineRule="exact"/>
+            </w:pPr>
+            <w:r>
+              <w:rPr>
+                <w:rFonts w:ascii="Arial Narrow" w:hAnsi="Arial Narrow" w:cs="Arial Narrow"/>
+                <w:sz w:val="14"/>
+                <w:szCs w:val="14"/>
+              </w:rPr>
+              <w:t xml:space="preserve">Premature ASMR (2021), male</w:t>
+            </w:r>
+          </w:p>
+        </w:tc>
+        <w:tc>
+          <w:tcPr>
+            <w:tcW w:w="650" w:type="dxa"/>
+            <w:tcMar>
+              <w:top w:w="20" w:type="dxa"/>
+              <w:left w:w="20" w:type="dxa"/>
+              <w:bottom w:w="20" w:type="dxa"/>
+              <w:right w:w="20" w:type="dxa"/>
+            </w:tcMar>
+          </w:tcPr>
+          <w:p>
+            <w:pPr>
+              <w:spacing w:after="0" w:line="120" w:lineRule="exact"/>
+            </w:pPr>
+            <w:r>
+              <w:rPr>
+                <w:rFonts w:ascii="Arial Narrow" w:hAnsi="Arial Narrow" w:cs="Arial Narrow"/>
+                <w:sz w:val="14"/>
+                <w:szCs w:val="14"/>
+              </w:rPr>
+              <w:t xml:space="preserve">2019</w:t>
+            </w:r>
+          </w:p>
+        </w:tc>
+        <w:tc>
+          <w:tcPr>
+            <w:tcW w:w="500" w:type="dxa"/>
+            <w:tcMar>
+              <w:top w:w="20" w:type="dxa"/>
+              <w:left w:w="20" w:type="dxa"/>
+              <w:bottom w:w="20" w:type="dxa"/>
+              <w:right w:w="20" w:type="dxa"/>
+            </w:tcMar>
+          </w:tcPr>
+          <w:p>
+            <w:pPr>
+              <w:spacing w:after="0" w:line="120" w:lineRule="exact"/>
+            </w:pPr>
+            <w:r>
+              <w:rPr>
+                <w:rFonts w:ascii="Arial Narrow" w:hAnsi="Arial Narrow" w:cs="Arial Narrow"/>
+                <w:sz w:val="14"/>
+                <w:szCs w:val="14"/>
+              </w:rPr>
+              <w:t xml:space="preserve">532</w:t>
+            </w:r>
+          </w:p>
+        </w:tc>
+        <w:tc>
+          <w:tcPr>
+            <w:tcW w:w="2200" w:type="dxa"/>
+            <w:tcMar>
+              <w:top w:w="20" w:type="dxa"/>
+              <w:left w:w="20" w:type="dxa"/>
+              <w:bottom w:w="20" w:type="dxa"/>
+              <w:right w:w="20" w:type="dxa"/>
+            </w:tcMar>
+          </w:tcPr>
+          <w:p>
+            <w:pPr>
+              <w:spacing w:after="0" w:line="120" w:lineRule="exact"/>
+            </w:pPr>
+            <w:r>
+              <w:rPr>
+                <w:rFonts w:ascii="Arial Narrow" w:hAnsi="Arial Narrow" w:cs="Arial Narrow"/>
+                <w:sz w:val="14"/>
+                <w:szCs w:val="14"/>
+              </w:rPr>
+              <w:t xml:space="preserve">-0.545 (&lt;0.001)</w:t>
+            </w:r>
+          </w:p>
+        </w:tc>
+        <w:tc>
+          <w:tcPr>
+            <w:tcW w:w="2200" w:type="dxa"/>
+            <w:tcMar>
+              <w:top w:w="20" w:type="dxa"/>
+              <w:left w:w="20" w:type="dxa"/>
+              <w:bottom w:w="20" w:type="dxa"/>
+              <w:right w:w="20" w:type="dxa"/>
+            </w:tcMar>
+          </w:tcPr>
+          <w:p>
+            <w:pPr>
+              <w:spacing w:after="0" w:line="120" w:lineRule="exact"/>
+            </w:pPr>
+            <w:r>
+              <w:rPr>
+                <w:rFonts w:ascii="Arial Narrow" w:hAnsi="Arial Narrow" w:cs="Arial Narrow"/>
+                <w:sz w:val="14"/>
+                <w:szCs w:val="14"/>
+              </w:rPr>
+              <w:t xml:space="preserve">0.708 (&lt;0.001)</w:t>
+            </w:r>
+          </w:p>
+        </w:tc>
+        <w:tc>
+          <w:tcPr>
+            <w:tcW w:w="2200" w:type="dxa"/>
+            <w:tcMar>
+              <w:top w:w="20" w:type="dxa"/>
+              <w:left w:w="20" w:type="dxa"/>
+              <w:bottom w:w="20" w:type="dxa"/>
+              <w:right w:w="20" w:type="dxa"/>
+            </w:tcMar>
+          </w:tcPr>
+          <w:p>
+            <w:pPr>
+              <w:spacing w:after="0" w:line="120" w:lineRule="exact"/>
+            </w:pPr>
+            <w:r>
+              <w:rPr>
+                <w:rFonts w:ascii="Arial Narrow" w:hAnsi="Arial Narrow" w:cs="Arial Narrow"/>
+                <w:sz w:val="14"/>
+                <w:szCs w:val="14"/>
+              </w:rPr>
+              <w:t xml:space="preserve">-0.553 (&lt;0.001)</w:t>
+            </w:r>
+          </w:p>
+        </w:tc>
+        <w:tc>
+          <w:tcPr>
+            <w:tcW w:w="2200" w:type="dxa"/>
+            <w:tcMar>
+              <w:top w:w="20" w:type="dxa"/>
+              <w:left w:w="20" w:type="dxa"/>
+              <w:bottom w:w="20" w:type="dxa"/>
+              <w:right w:w="20" w:type="dxa"/>
+            </w:tcMar>
+          </w:tcPr>
+          <w:p>
+            <w:pPr>
+              <w:spacing w:after="0" w:line="120" w:lineRule="exact"/>
+            </w:pPr>
+            <w:r>
+              <w:rPr>
+                <w:rFonts w:ascii="Arial Narrow" w:hAnsi="Arial Narrow" w:cs="Arial Narrow"/>
+                <w:sz w:val="14"/>
+                <w:szCs w:val="14"/>
+              </w:rPr>
+              <w:t xml:space="preserve">0.490 (&lt;0.001)</w:t>
+            </w:r>
+          </w:p>
+        </w:tc>
+        <w:tc>
+          <w:tcPr>
+            <w:tcW w:w="2200" w:type="dxa"/>
+            <w:tcMar>
+              <w:top w:w="20" w:type="dxa"/>
+              <w:left w:w="20" w:type="dxa"/>
+              <w:bottom w:w="20" w:type="dxa"/>
+              <w:right w:w="20" w:type="dxa"/>
+            </w:tcMar>
+          </w:tcPr>
+          <w:p>
+            <w:pPr>
+              <w:spacing w:after="0" w:line="120" w:lineRule="exact"/>
+            </w:pPr>
+            <w:r>
+              <w:rPr>
+                <w:rFonts w:ascii="Arial Narrow" w:hAnsi="Arial Narrow" w:cs="Arial Narrow"/>
+                <w:sz w:val="14"/>
+                <w:szCs w:val="14"/>
+              </w:rPr>
+              <w:t xml:space="preserve">-0.791 (&lt;0.001)</w:t>
             </w:r>
           </w:p>
         </w:tc>

</xml_diff>